<commit_message>
Inlcude three persona review feedback.
</commit_message>
<xml_diff>
--- a/tests/output/test_resume.docx
+++ b/tests/output/test_resume.docx
@@ -13,7 +13,7 @@
           <w:color w:val="1A1A1A"/>
           <w:sz w:val="40"/>
         </w:rPr>
-        <w:t>Lukas Brenner</w:t>
+        <w:t>Maria Chen</w:t>
       </w:r>
     </w:p>
     <w:p>
@@ -26,7 +26,7 @@
           <w:color w:val="555555"/>
           <w:sz w:val="17"/>
         </w:rPr>
-        <w:t>Berlin, Germany  ·  lukas.brenner@email.com  ·  linkedin.com/in/lukasbrenner  ·  github.com/lukasbrenner</w:t>
+        <w:t>Munich, Germany  ·  maria.chen@email.com  ·  linkedin.com/in/mariachen  ·  github.com/mariachen</w:t>
       </w:r>
     </w:p>
     <w:p>
@@ -39,7 +39,7 @@
           <w:color w:val="555555"/>
           <w:sz w:val="17"/>
         </w:rPr>
-        <w:t>German (native)  ·  English (full professional proficiency)</w:t>
+        <w:t>English (native)  ·  German (professional working proficiency)</w:t>
       </w:r>
     </w:p>
     <w:p>
@@ -69,7 +69,7 @@
           <w:rFonts w:ascii="Calibri" w:hAnsi="Calibri" w:eastAsia="Calibri" w:cs="Calibri"/>
           <w:sz w:val="18"/>
         </w:rPr>
-        <w:t>Software engineer with 6+ years of experience designing cloud-native platforms and microservice architectures. Delivered observability tooling adopted by 3 product teams and reduced mean time to recovery by 40% through automated incident-response pipelines. Combines hands-on Python and Kubernetes expertise with a passion for developer productivity and cross-team knowledge sharing.</w:t>
+        <w:t>Full-stack software engineer with 6+ years of experience building scalable web applications and leading cross-functional teams. Proven track record of delivering cloud-native platforms processing 2M+ daily transactions, reducing infrastructure costs by 35% through containerization and CI/CD automation. Passionate about developer experience, mentoring junior engineers, and driving engineering best practices at your company.</w:t>
       </w:r>
     </w:p>
     <w:p>
@@ -98,7 +98,7 @@
           <w:rFonts w:ascii="Calibri" w:hAnsi="Calibri" w:eastAsia="Calibri" w:cs="Calibri"/>
           <w:sz w:val="17"/>
         </w:rPr>
-        <w:t>Cloud-Native Architecture, Microservices, Platform Engineering, CI/CD Pipeline Design, Observability, Agile/Scrum, Technical Mentoring, Stakeholder Communication</w:t>
+        <w:t>Cloud Architecture, Full-Stack Development, Team Leadership, CI/CD Pipeline Design, Microservices, Agile/Scrum, Stakeholder Communication, Technical Mentoring</w:t>
       </w:r>
     </w:p>
     <w:p>
@@ -135,7 +135,7 @@
           <w:rFonts w:ascii="Calibri" w:hAnsi="Calibri" w:eastAsia="Calibri" w:cs="Calibri"/>
           <w:sz w:val="17"/>
         </w:rPr>
-        <w:t>Python, TypeScript, Go, SQL</w:t>
+        <w:t>TypeScript, Python, Go, SQL, HTML/CSS</w:t>
       </w:r>
     </w:p>
     <w:p>
@@ -148,14 +148,14 @@
           <w:b/>
           <w:sz w:val="17"/>
         </w:rPr>
-        <w:t xml:space="preserve">Frameworks &amp; Libraries: </w:t>
+        <w:t xml:space="preserve">Frameworks: </w:t>
       </w:r>
       <w:r>
         <w:rPr>
           <w:rFonts w:ascii="Calibri" w:hAnsi="Calibri" w:eastAsia="Calibri" w:cs="Calibri"/>
           <w:sz w:val="17"/>
         </w:rPr>
-        <w:t>FastAPI, React, Next.js, Celery</w:t>
+        <w:t>React, Next.js, FastAPI, Express.js</w:t>
       </w:r>
     </w:p>
     <w:p>
@@ -175,7 +175,7 @@
           <w:rFonts w:ascii="Calibri" w:hAnsi="Calibri" w:eastAsia="Calibri" w:cs="Calibri"/>
           <w:sz w:val="17"/>
         </w:rPr>
-        <w:t>AWS (EKS, Lambda, RDS, S3), Docker, Kubernetes, Terraform, GitHub Actions</w:t>
+        <w:t>AWS (ECS, Lambda, RDS, S3), Docker, Kubernetes, Terraform, GitHub Actions</w:t>
       </w:r>
     </w:p>
     <w:p>
@@ -195,7 +195,7 @@
           <w:rFonts w:ascii="Calibri" w:hAnsi="Calibri" w:eastAsia="Calibri" w:cs="Calibri"/>
           <w:sz w:val="17"/>
         </w:rPr>
-        <w:t>PostgreSQL, Redis, Elasticsearch</w:t>
+        <w:t>PostgreSQL, Redis, DynamoDB</w:t>
       </w:r>
     </w:p>
     <w:p>
@@ -215,7 +215,7 @@
           <w:rFonts w:ascii="Calibri" w:hAnsi="Calibri" w:eastAsia="Calibri" w:cs="Calibri"/>
           <w:sz w:val="17"/>
         </w:rPr>
-        <w:t>Scrum, Kanban, TDD, Site Reliability Engineering</w:t>
+        <w:t>Scrum, Kanban, TDD, Domain-Driven Design</w:t>
       </w:r>
     </w:p>
     <w:p>
@@ -261,7 +261,7 @@
           <w:color w:val="888888"/>
           <w:sz w:val="16"/>
         </w:rPr>
-        <w:t>CloudNova GmbH  |  Berlin, Germany  |  Mar 2022 – Present</w:t>
+        <w:t>TechCorp GmbH  |  Munich, Germany  |  Mar 2022 – Present</w:t>
       </w:r>
     </w:p>
     <w:p>
@@ -285,7 +285,7 @@
           <w:rFonts w:ascii="Calibri" w:hAnsi="Calibri" w:eastAsia="Calibri" w:cs="Calibri"/>
           <w:sz w:val="17"/>
         </w:rPr>
-        <w:t>Architected an observability platform using Prometheus, Grafana, and custom Python exporters, adopted by 3 product teams and reducing mean time to recovery by 40%.</w:t>
+        <w:t>Led the migration of a monolithic Rails application to a microservices architecture on AWS ECS, reducing average response time from 800ms to 120ms and improving system uptime to 99.95%.</w:t>
       </w:r>
     </w:p>
     <w:p>
@@ -309,7 +309,7 @@
           <w:rFonts w:ascii="Calibri" w:hAnsi="Calibri" w:eastAsia="Calibri" w:cs="Calibri"/>
           <w:sz w:val="17"/>
         </w:rPr>
-        <w:t>Led migration of 12 services from EC2 to Kubernetes (EKS), achieving 99.95% uptime and cutting infrastructure costs by 25%.</w:t>
+        <w:t>Designed and implemented a real-time event processing pipeline using Kafka and Lambda, handling 2M+ daily events with sub-second latency.</w:t>
       </w:r>
     </w:p>
     <w:p>
@@ -333,7 +333,7 @@
           <w:rFonts w:ascii="Calibri" w:hAnsi="Calibri" w:eastAsia="Calibri" w:cs="Calibri"/>
           <w:sz w:val="17"/>
         </w:rPr>
-        <w:t>Designed event-driven data pipeline with Kafka and AWS Lambda processing 500K+ daily events for real-time anomaly detection.</w:t>
+        <w:t>Mentored a team of 4 junior engineers through weekly code reviews and pair programming sessions, resulting in 40% faster onboarding.</w:t>
       </w:r>
     </w:p>
     <w:p>
@@ -357,7 +357,7 @@
           <w:rFonts w:ascii="Calibri" w:hAnsi="Calibri" w:eastAsia="Calibri" w:cs="Calibri"/>
           <w:sz w:val="17"/>
         </w:rPr>
-        <w:t>Mentored 4 junior engineers through weekly code reviews and pair programming, reducing average onboarding time by 35%.</w:t>
+        <w:t>Championed adoption of Terraform for infrastructure-as-code, managing 50+ AWS resources across 3 environments with zero-downtime deployments.</w:t>
       </w:r>
     </w:p>
     <w:p>
@@ -381,7 +381,7 @@
           <w:rFonts w:ascii="Calibri" w:hAnsi="Calibri" w:eastAsia="Calibri" w:cs="Calibri"/>
           <w:sz w:val="17"/>
         </w:rPr>
-        <w:t>Introduced Terraform modules shared across 3 environments, eliminating manual provisioning and enabling zero-downtime deployments.</w:t>
+        <w:t>Established engineering RFC process adopted by 3 teams, improving cross-team alignment on architectural decisions.</w:t>
       </w:r>
     </w:p>
     <w:p>
@@ -784,7 +784,7 @@
           <w:b/>
           <w:color w:val="24292F"/>
         </w:rPr>
-        <w:t>OPEN SOURCE CONTRIBUTIONS, PATENTS &amp; PUBLICATIONS</w:t>
+        <w:t>PUBLICATIONS &amp; OPEN SOURCE</w:t>
       </w:r>
     </w:p>
     <w:p>

</xml_diff>